<commit_message>
feat: added pcb to buck3V3
</commit_message>
<xml_diff>
--- a/docs/uni-submission/end-semester-one report.docx
+++ b/docs/uni-submission/end-semester-one report.docx
@@ -6045,7 +6045,15 @@
       </w:pPr>
       <w:r>
         <w:rPr/>
-        <w:t>For LMZ23610 and TPSM82903, their simulation modules are not available in various simulation platforms. With other applications, no relevance of simulation results and the reality of the behaviour of such modules were recorded from the research. Therefore, WEBENCH Power Designer from Texas Instruments was used for simulation of behaviours of these models.</w:t>
+        <w:t xml:space="preserve">For LMZ23610 and TPSM82903, their simulation modules are not available in various simulation platforms. With other applications, no relevance of simulation results and the reality of the behaviour of such modules were recorded from the research. Therefore, WEBENCH Power Designer from Texas Instruments was used for </w:t>
+      </w:r>
+      <w:r>
+        <w:rPr/>
+        <w:t>design estimation on behaviours of the chosen modules</w:t>
+      </w:r>
+      <w:r>
+        <w:rPr/>
+        <w:t>.</w:t>
       </w:r>
     </w:p>
     <w:p>
@@ -6094,7 +6102,7 @@
       <w:bookmarkEnd w:id="54"/>
       <w:r>
         <w:drawing>
-          <wp:anchor distT="0" distB="0" distL="0" distR="0" simplePos="0" relativeHeight="21" behindDoc="0" locked="0" layoutInCell="0" allowOverlap="1">
+          <wp:anchor distT="0" distB="0" distL="0" distR="0" simplePos="0" relativeHeight="20" behindDoc="0" locked="0" layoutInCell="0" allowOverlap="1">
             <wp:simplePos x="0" y="0"/>
             <wp:positionH relativeFrom="column">
               <wp:align>center</wp:align>
@@ -6181,7 +6189,7 @@
       <w:bookmarkEnd w:id="55"/>
       <w:r>
         <w:drawing>
-          <wp:anchor distT="0" distB="0" distL="0" distR="0" simplePos="0" relativeHeight="22" behindDoc="0" locked="0" layoutInCell="0" allowOverlap="1">
+          <wp:anchor distT="0" distB="0" distL="0" distR="0" simplePos="0" relativeHeight="21" behindDoc="0" locked="0" layoutInCell="0" allowOverlap="1">
             <wp:simplePos x="0" y="0"/>
             <wp:positionH relativeFrom="column">
               <wp:align>center</wp:align>
@@ -6239,7 +6247,39 @@
       </w:pPr>
       <w:r>
         <w:rPr/>
-        <w:t>For TPSM82903 module, there are three simulation done with that particular design circuit. The simulations are as explained below:</w:t>
+        <w:t xml:space="preserve">For TPSM82903 module </w:t>
+      </w:r>
+      <w:r>
+        <w:rPr/>
+        <w:t>also</w:t>
+      </w:r>
+      <w:r>
+        <w:rPr/>
+        <w:t xml:space="preserve">, there </w:t>
+      </w:r>
+      <w:r>
+        <w:rPr/>
+        <w:t>were</w:t>
+      </w:r>
+      <w:r>
+        <w:rPr/>
+        <w:t xml:space="preserve"> t</w:t>
+      </w:r>
+      <w:r>
+        <w:rPr/>
+        <w:t>wo</w:t>
+      </w:r>
+      <w:r>
+        <w:rPr/>
+        <w:t xml:space="preserve"> simulation</w:t>
+      </w:r>
+      <w:r>
+        <w:rPr/>
+        <w:t>s</w:t>
+      </w:r>
+      <w:r>
+        <w:rPr/>
+        <w:t xml:space="preserve"> done with that particular design circuit. The simulations are as explained below:</w:t>
       </w:r>
     </w:p>
     <w:p>
@@ -6402,85 +6442,6 @@
     </w:p>
     <w:p>
       <w:pPr>
-        <w:pStyle w:val="BodyText"/>
-        <w:numPr>
-          <w:ilvl w:val="0"/>
-          <w:numId w:val="13"/>
-        </w:numPr>
-        <w:rPr/>
-      </w:pPr>
-      <w:r>
-        <w:rPr/>
-        <w:t>At steady state: as seen at steady state where the output voltage is greater than 4.835V, the voltage still increases to reach to its final desired voltage level which is 5V.</w:t>
-      </w:r>
-    </w:p>
-    <w:p>
-      <w:pPr>
-        <w:pStyle w:val="Figure"/>
-        <w:numPr>
-          <w:ilvl w:val="0"/>
-          <w:numId w:val="0"/>
-        </w:numPr>
-        <w:ind w:hanging="0" w:start="720"/>
-        <w:rPr/>
-      </w:pPr>
-      <w:bookmarkStart w:id="58" w:name="__RefHeading___Toc858_443172832"/>
-      <w:bookmarkEnd w:id="58"/>
-      <w:r>
-        <w:drawing>
-          <wp:anchor distT="0" distB="0" distL="0" distR="0" simplePos="0" relativeHeight="20" behindDoc="0" locked="0" layoutInCell="0" allowOverlap="1">
-            <wp:simplePos x="0" y="0"/>
-            <wp:positionH relativeFrom="column">
-              <wp:align>center</wp:align>
-            </wp:positionH>
-            <wp:positionV relativeFrom="paragraph">
-              <wp:posOffset>635</wp:posOffset>
-            </wp:positionV>
-            <wp:extent cx="4592320" cy="3444240"/>
-            <wp:effectExtent l="0" t="0" r="0" b="0"/>
-            <wp:wrapTopAndBottom/>
-            <wp:docPr id="21" name="Image15"/>
-            <wp:cNvGraphicFramePr>
-              <a:graphicFrameLocks xmlns:a="http://schemas.openxmlformats.org/drawingml/2006/main" noChangeAspect="1"/>
-            </wp:cNvGraphicFramePr>
-            <a:graphic xmlns:a="http://schemas.openxmlformats.org/drawingml/2006/main">
-              <a:graphicData uri="http://schemas.openxmlformats.org/drawingml/2006/picture">
-                <pic:pic xmlns:pic="http://schemas.openxmlformats.org/drawingml/2006/picture">
-                  <pic:nvPicPr>
-                    <pic:cNvPr id="21" name="Image15"/>
-                    <pic:cNvPicPr>
-                      <a:picLocks noChangeAspect="1" noChangeArrowheads="1"/>
-                    </pic:cNvPicPr>
-                  </pic:nvPicPr>
-                  <pic:blipFill>
-                    <a:blip r:embed="rId25"/>
-                    <a:stretch>
-                      <a:fillRect/>
-                    </a:stretch>
-                  </pic:blipFill>
-                  <pic:spPr bwMode="auto">
-                    <a:xfrm>
-                      <a:off x="0" y="0"/>
-                      <a:ext cx="4592320" cy="3444240"/>
-                    </a:xfrm>
-                    <a:prstGeom prst="rect">
-                      <a:avLst/>
-                    </a:prstGeom>
-                    <a:noFill/>
-                  </pic:spPr>
-                </pic:pic>
-              </a:graphicData>
-            </a:graphic>
-          </wp:anchor>
-        </w:drawing>
-      </w:r>
-      <w:r>
-        <w:rPr/>
-        <w:t>Figure : PTSM82903 simulation result at steady state.</w:t>
-      </w:r>
-    </w:p>
-    <w:p>
-      <w:pPr>
         <w:pStyle w:val="Heading3"/>
         <w:numPr>
           <w:ilvl w:val="2"/>
@@ -6489,41 +6450,41 @@
         <w:ind w:hanging="0" w:start="0"/>
         <w:rPr/>
       </w:pPr>
-      <w:bookmarkStart w:id="59" w:name="__RefHeading___Toc1270_443172832"/>
+      <w:bookmarkStart w:id="58" w:name="__RefHeading___Toc1270_443172832"/>
+      <w:bookmarkEnd w:id="58"/>
+      <w:r>
+        <w:rPr/>
+        <w:t>4.</w:t>
+      </w:r>
+      <w:r>
+        <w:rPr/>
+        <w:t>2.</w:t>
+      </w:r>
+      <w:r>
+        <w:rPr/>
+        <w:t>3 MOTOR DRIVER CIRCUIT SIMULATION</w:t>
+      </w:r>
+    </w:p>
+    <w:p>
+      <w:pPr>
+        <w:pStyle w:val="BodyText"/>
+        <w:rPr/>
+      </w:pPr>
+      <w:r>
+        <w:rPr/>
+        <w:t>The designed schematic for custom motor driver using ULN2003A chip for driving a stepper motor was simulated using Proteus Design Suite (PDS) in order to observe and record the studied behaviour of the said module. The simulation was as follows:</w:t>
+      </w:r>
+    </w:p>
+    <w:p>
+      <w:pPr>
+        <w:pStyle w:val="Figure"/>
+        <w:rPr/>
+      </w:pPr>
+      <w:bookmarkStart w:id="59" w:name="__RefHeading___Toc1063_443172832"/>
       <w:bookmarkEnd w:id="59"/>
       <w:r>
-        <w:rPr/>
-        <w:t>4.</w:t>
-      </w:r>
-      <w:r>
-        <w:rPr/>
-        <w:t>2.</w:t>
-      </w:r>
-      <w:r>
-        <w:rPr/>
-        <w:t>3 MOTOR DRIVER CIRCUIT SIMULATION</w:t>
-      </w:r>
-    </w:p>
-    <w:p>
-      <w:pPr>
-        <w:pStyle w:val="BodyText"/>
-        <w:rPr/>
-      </w:pPr>
-      <w:r>
-        <w:rPr/>
-        <w:t>The designed schematic for custom motor driver using ULN2003A chip for driving a stepper motor was simulated using Proteus Design Suite (PDS) in order to observe and record the studied behaviour of the said module. The simulation was as follows:</w:t>
-      </w:r>
-    </w:p>
-    <w:p>
-      <w:pPr>
-        <w:pStyle w:val="Figure"/>
-        <w:rPr/>
-      </w:pPr>
-      <w:bookmarkStart w:id="60" w:name="__RefHeading___Toc1063_443172832"/>
-      <w:bookmarkEnd w:id="60"/>
-      <w:r>
         <w:drawing>
-          <wp:anchor distT="0" distB="0" distL="0" distR="0" simplePos="0" relativeHeight="23" behindDoc="0" locked="0" layoutInCell="0" allowOverlap="1">
+          <wp:anchor distT="0" distB="0" distL="0" distR="0" simplePos="0" relativeHeight="22" behindDoc="0" locked="0" layoutInCell="0" allowOverlap="1">
             <wp:simplePos x="0" y="0"/>
             <wp:positionH relativeFrom="column">
               <wp:posOffset>46355</wp:posOffset>
@@ -6534,7 +6495,7 @@
             <wp:extent cx="3197860" cy="2027555"/>
             <wp:effectExtent l="0" t="0" r="0" b="0"/>
             <wp:wrapTopAndBottom/>
-            <wp:docPr id="22" name="Image22"/>
+            <wp:docPr id="21" name="Image22"/>
             <wp:cNvGraphicFramePr>
               <a:graphicFrameLocks xmlns:a="http://schemas.openxmlformats.org/drawingml/2006/main" noChangeAspect="1"/>
             </wp:cNvGraphicFramePr>
@@ -6542,13 +6503,13 @@
               <a:graphicData uri="http://schemas.openxmlformats.org/drawingml/2006/picture">
                 <pic:pic xmlns:pic="http://schemas.openxmlformats.org/drawingml/2006/picture">
                   <pic:nvPicPr>
-                    <pic:cNvPr id="22" name="Image22"/>
+                    <pic:cNvPr id="21" name="Image22"/>
                     <pic:cNvPicPr>
                       <a:picLocks noChangeAspect="1" noChangeArrowheads="1"/>
                     </pic:cNvPicPr>
                   </pic:nvPicPr>
                   <pic:blipFill>
-                    <a:blip r:embed="rId26"/>
+                    <a:blip r:embed="rId25"/>
                     <a:srcRect l="0" t="2748" r="2331" b="2661"/>
                     <a:stretch>
                       <a:fillRect/>
@@ -6570,7 +6531,7 @@
           </wp:anchor>
         </w:drawing>
         <w:drawing>
-          <wp:anchor distT="0" distB="0" distL="0" distR="0" simplePos="0" relativeHeight="24" behindDoc="0" locked="0" layoutInCell="0" allowOverlap="1">
+          <wp:anchor distT="0" distB="0" distL="0" distR="0" simplePos="0" relativeHeight="23" behindDoc="0" locked="0" layoutInCell="0" allowOverlap="1">
             <wp:simplePos x="0" y="0"/>
             <wp:positionH relativeFrom="column">
               <wp:posOffset>3359785</wp:posOffset>
@@ -6581,7 +6542,7 @@
             <wp:extent cx="2874645" cy="2021205"/>
             <wp:effectExtent l="0" t="0" r="0" b="0"/>
             <wp:wrapTopAndBottom/>
-            <wp:docPr id="23" name="Image23"/>
+            <wp:docPr id="22" name="Image23"/>
             <wp:cNvGraphicFramePr>
               <a:graphicFrameLocks xmlns:a="http://schemas.openxmlformats.org/drawingml/2006/main" noChangeAspect="1"/>
             </wp:cNvGraphicFramePr>
@@ -6589,13 +6550,13 @@
               <a:graphicData uri="http://schemas.openxmlformats.org/drawingml/2006/picture">
                 <pic:pic xmlns:pic="http://schemas.openxmlformats.org/drawingml/2006/picture">
                   <pic:nvPicPr>
-                    <pic:cNvPr id="23" name="Image23"/>
+                    <pic:cNvPr id="22" name="Image23"/>
                     <pic:cNvPicPr>
                       <a:picLocks noChangeAspect="1" noChangeArrowheads="1"/>
                     </pic:cNvPicPr>
                   </pic:nvPicPr>
                   <pic:blipFill>
-                    <a:blip r:embed="rId27"/>
+                    <a:blip r:embed="rId26"/>
                     <a:stretch>
                       <a:fillRect/>
                     </a:stretch>
@@ -6650,7 +6611,19 @@
         <w:rPr>
           <w:rFonts w:eastAsia="Noto Serif CJK SC" w:cs="Noto Sans Devanagari"/>
         </w:rPr>
-        <w:t xml:space="preserve"> turn on the stepper motor. Thus, the connection of the motor driver circuit is electrically correct.</w:t>
+        <w:t xml:space="preserve"> turn on the stepper motor, </w:t>
+      </w:r>
+      <w:r>
+        <w:rPr>
+          <w:rFonts w:eastAsia="Noto Serif CJK SC" w:cs="Noto Sans Devanagari"/>
+        </w:rPr>
+        <w:t>according to the steps and respective angular displacement set</w:t>
+      </w:r>
+      <w:r>
+        <w:rPr>
+          <w:rFonts w:eastAsia="Noto Serif CJK SC" w:cs="Noto Sans Devanagari"/>
+        </w:rPr>
+        <w:t>. Thus, the connection of the motor driver circuit is electrically correct.</w:t>
       </w:r>
       <w:r>
         <w:br w:type="page"/>
@@ -6667,8 +6640,8 @@
         <w:ind w:hanging="0" w:start="0"/>
         <w:rPr/>
       </w:pPr>
-      <w:bookmarkStart w:id="61" w:name="__RefHeading___Toc2934_3810426074"/>
-      <w:bookmarkEnd w:id="61"/>
+      <w:bookmarkStart w:id="60" w:name="__RefHeading___Toc2934_3810426074"/>
+      <w:bookmarkEnd w:id="60"/>
       <w:r>
         <w:rPr/>
         <w:t>REFERENCES</w:t>
@@ -6701,7 +6674,7 @@
         <w:rPr/>
         <w:t xml:space="preserve">Aman Prasad, Shraddha Kumar, Keshav Shriram, Prof. Dr. Vikram Mane, “IOT Based Pen Vending Machine”, Published in International Research Journal of Innovations in Engineering and Technology - IRJIET, Volume 8, Issue 3, pp 367-373, March 2024. Article DOI </w:t>
       </w:r>
-      <w:hyperlink r:id="rId28">
+      <w:hyperlink r:id="rId27">
         <w:r>
           <w:rPr>
             <w:rStyle w:val="Hyperlink"/>
@@ -6760,9 +6733,9 @@
       </w:r>
     </w:p>
     <w:sectPr>
-      <w:footerReference w:type="even" r:id="rId29"/>
-      <w:footerReference w:type="default" r:id="rId30"/>
-      <w:footerReference w:type="first" r:id="rId31"/>
+      <w:footerReference w:type="even" r:id="rId28"/>
+      <w:footerReference w:type="default" r:id="rId29"/>
+      <w:footerReference w:type="first" r:id="rId30"/>
       <w:type w:val="nextPage"/>
       <w:pgSz w:w="11906" w:h="16838"/>
       <w:pgMar w:left="1134" w:right="1134" w:gutter="0" w:header="0" w:top="1134" w:footer="1134" w:bottom="1693"/>
@@ -6881,6 +6854,40 @@
       <w:jc w:val="center"/>
       <w:rPr/>
     </w:pPr>
+    <w:bookmarkStart w:id="61" w:name="PageNumWizard_FOOTER_Index1"/>
+    <w:r>
+      <w:rPr/>
+      <w:fldChar w:fldCharType="begin"/>
+    </w:r>
+    <w:r>
+      <w:rPr/>
+      <w:instrText xml:space="preserve"> PAGE </w:instrText>
+    </w:r>
+    <w:r>
+      <w:rPr/>
+      <w:fldChar w:fldCharType="separate"/>
+    </w:r>
+    <w:r>
+      <w:rPr/>
+      <w:t>20</w:t>
+    </w:r>
+    <w:r>
+      <w:rPr/>
+      <w:fldChar w:fldCharType="end"/>
+    </w:r>
+    <w:bookmarkEnd w:id="61"/>
+  </w:p>
+</w:ftr>
+</file>
+
+<file path=word/footer6.xml><?xml version="1.0" encoding="utf-8"?>
+<w:ftr xmlns:o="urn:schemas-microsoft-com:office:office" xmlns:r="http://schemas.openxmlformats.org/officeDocument/2006/relationships" xmlns:v="urn:schemas-microsoft-com:vml" xmlns:w="http://schemas.openxmlformats.org/wordprocessingml/2006/main" xmlns:w10="urn:schemas-microsoft-com:office:word" xmlns:wp="http://schemas.openxmlformats.org/drawingml/2006/wordprocessingDrawing" xmlns:pic="http://schemas.openxmlformats.org/drawingml/2006/picture" xmlns:wps="http://schemas.microsoft.com/office/word/2010/wordprocessingShape" xmlns:wpg="http://schemas.microsoft.com/office/word/2010/wordprocessingGroup" xmlns:mc="http://schemas.openxmlformats.org/markup-compatibility/2006" xmlns:wp14="http://schemas.microsoft.com/office/word/2010/wordprocessingDrawing" xmlns:w14="http://schemas.microsoft.com/office/word/2010/wordml" xmlns:w15="http://schemas.microsoft.com/office/word/2012/wordml" mc:Ignorable="w14 wp14 w15">
+  <w:p>
+    <w:pPr>
+      <w:pStyle w:val="Footer"/>
+      <w:jc w:val="center"/>
+      <w:rPr/>
+    </w:pPr>
     <w:bookmarkStart w:id="62" w:name="PageNumWizard_FOOTER_Index1"/>
     <w:r>
       <w:rPr/>
@@ -6903,40 +6910,6 @@
       <w:fldChar w:fldCharType="end"/>
     </w:r>
     <w:bookmarkEnd w:id="62"/>
-  </w:p>
-</w:ftr>
-</file>
-
-<file path=word/footer6.xml><?xml version="1.0" encoding="utf-8"?>
-<w:ftr xmlns:o="urn:schemas-microsoft-com:office:office" xmlns:r="http://schemas.openxmlformats.org/officeDocument/2006/relationships" xmlns:v="urn:schemas-microsoft-com:vml" xmlns:w="http://schemas.openxmlformats.org/wordprocessingml/2006/main" xmlns:w10="urn:schemas-microsoft-com:office:word" xmlns:wp="http://schemas.openxmlformats.org/drawingml/2006/wordprocessingDrawing" xmlns:pic="http://schemas.openxmlformats.org/drawingml/2006/picture" xmlns:wps="http://schemas.microsoft.com/office/word/2010/wordprocessingShape" xmlns:wpg="http://schemas.microsoft.com/office/word/2010/wordprocessingGroup" xmlns:mc="http://schemas.openxmlformats.org/markup-compatibility/2006" xmlns:wp14="http://schemas.microsoft.com/office/word/2010/wordprocessingDrawing" xmlns:w14="http://schemas.microsoft.com/office/word/2010/wordml" xmlns:w15="http://schemas.microsoft.com/office/word/2012/wordml" mc:Ignorable="w14 wp14 w15">
-  <w:p>
-    <w:pPr>
-      <w:pStyle w:val="Footer"/>
-      <w:jc w:val="center"/>
-      <w:rPr/>
-    </w:pPr>
-    <w:bookmarkStart w:id="63" w:name="PageNumWizard_FOOTER_Index1"/>
-    <w:r>
-      <w:rPr/>
-      <w:fldChar w:fldCharType="begin"/>
-    </w:r>
-    <w:r>
-      <w:rPr/>
-      <w:instrText xml:space="preserve"> PAGE </w:instrText>
-    </w:r>
-    <w:r>
-      <w:rPr/>
-      <w:fldChar w:fldCharType="separate"/>
-    </w:r>
-    <w:r>
-      <w:rPr/>
-      <w:t>20</w:t>
-    </w:r>
-    <w:r>
-      <w:rPr/>
-      <w:fldChar w:fldCharType="end"/>
-    </w:r>
-    <w:bookmarkEnd w:id="63"/>
   </w:p>
 </w:ftr>
 </file>

</xml_diff>

<commit_message>
docs: added presentation for end-semester
</commit_message>
<xml_diff>
--- a/docs/uni-submission/end-semester-one report.docx
+++ b/docs/uni-submission/end-semester-one report.docx
@@ -426,16 +426,17 @@
             </w:rPr>
             <w:fldChar w:fldCharType="separate"/>
           </w:r>
-          <w:hyperlink w:anchor="__RefHeading___Toc356_962504967" w:tooltip="ABSTRACT">
-            <w:r>
-              <w:rPr>
-                <w:rStyle w:val="IndexLink"/>
-              </w:rPr>
-              <w:t>ABSTRACT</w:t>
-              <w:tab/>
-              <w:t>ii</w:t>
-            </w:r>
-          </w:hyperlink>
+          <w:r>
+            <w:rPr>
+              <w:rStyle w:val="IndexLink"/>
+            </w:rPr>
+            <w:t>ABSTRACT</w:t>
+          </w:r>
+          <w:r>
+            <w:rPr/>
+            <w:tab/>
+            <w:t>ii</w:t>
+          </w:r>
         </w:p>
         <w:p>
           <w:pPr>
@@ -446,16 +447,12 @@
             </w:tabs>
             <w:rPr/>
           </w:pPr>
-          <w:hyperlink w:anchor="__RefHeading___Toc4364_2841859078" w:tooltip="TABLE OF CONTENTS">
-            <w:r>
-              <w:rPr>
-                <w:rStyle w:val="IndexLink"/>
-              </w:rPr>
-              <w:t>TABLE OF CONTENTS</w:t>
-              <w:tab/>
-              <w:t>iii</w:t>
-            </w:r>
-          </w:hyperlink>
+          <w:r>
+            <w:rPr/>
+            <w:t>TABLE OF CONTENTS</w:t>
+            <w:tab/>
+            <w:t>iii</w:t>
+          </w:r>
         </w:p>
         <w:p>
           <w:pPr>
@@ -466,16 +463,12 @@
             </w:tabs>
             <w:rPr/>
           </w:pPr>
-          <w:hyperlink w:anchor="__RefHeading___Toc874_565102395" w:tooltip="LIST OF TABLES">
-            <w:r>
-              <w:rPr>
-                <w:rStyle w:val="IndexLink"/>
-              </w:rPr>
-              <w:t>LIST OF TABLES</w:t>
-              <w:tab/>
-              <w:t>v</w:t>
-            </w:r>
-          </w:hyperlink>
+          <w:r>
+            <w:rPr/>
+            <w:t>LIST OF TABLES</w:t>
+            <w:tab/>
+            <w:t>v</w:t>
+          </w:r>
         </w:p>
         <w:p>
           <w:pPr>
@@ -486,16 +479,12 @@
             </w:tabs>
             <w:rPr/>
           </w:pPr>
-          <w:hyperlink w:anchor="__RefHeading___Toc872_565102395" w:tooltip="LIST OF FIGURES">
-            <w:r>
-              <w:rPr>
-                <w:rStyle w:val="IndexLink"/>
-              </w:rPr>
-              <w:t>LIST OF FIGURES</w:t>
-              <w:tab/>
-              <w:t>vi</w:t>
-            </w:r>
-          </w:hyperlink>
+          <w:r>
+            <w:rPr/>
+            <w:t>LIST OF FIGURES</w:t>
+            <w:tab/>
+            <w:t>vi</w:t>
+          </w:r>
         </w:p>
         <w:p>
           <w:pPr>
@@ -506,16 +495,12 @@
             </w:tabs>
             <w:rPr/>
           </w:pPr>
-          <w:hyperlink w:anchor="__RefHeading___Toc2229_3810426074" w:tooltip="LIST OF ABBREVIATIONS">
-            <w:r>
-              <w:rPr>
-                <w:rStyle w:val="IndexLink"/>
-              </w:rPr>
-              <w:t>LIST OF ABBREVIATIONS</w:t>
-              <w:tab/>
-              <w:t>vii</w:t>
-            </w:r>
-          </w:hyperlink>
+          <w:r>
+            <w:rPr/>
+            <w:t>LIST OF ABBREVIATIONS</w:t>
+            <w:tab/>
+            <w:t>vii</w:t>
+          </w:r>
         </w:p>
         <w:p>
           <w:pPr>
@@ -526,16 +511,12 @@
             </w:tabs>
             <w:rPr/>
           </w:pPr>
-          <w:hyperlink w:anchor="__RefHeading___Toc2325_3810426074" w:tooltip="CHAPTER ONE: INTRODUCTION">
-            <w:r>
-              <w:rPr>
-                <w:rStyle w:val="IndexLink"/>
-              </w:rPr>
-              <w:t>CHAPTER ONE: INTRODUCTION</w:t>
-              <w:tab/>
-              <w:t>1</w:t>
-            </w:r>
-          </w:hyperlink>
+          <w:r>
+            <w:rPr/>
+            <w:t>CHAPTER ONE: INTRODUCTION</w:t>
+            <w:tab/>
+            <w:t>1</w:t>
+          </w:r>
         </w:p>
         <w:p>
           <w:pPr>
@@ -546,16 +527,12 @@
             </w:tabs>
             <w:rPr/>
           </w:pPr>
-          <w:hyperlink w:anchor="__RefHeading___Toc2354_3810426074" w:tooltip="1.1 BACKGROUND">
-            <w:r>
-              <w:rPr>
-                <w:rStyle w:val="IndexLink"/>
-              </w:rPr>
-              <w:t>1.1 BACKGROUND</w:t>
-              <w:tab/>
-              <w:t>1</w:t>
-            </w:r>
-          </w:hyperlink>
+          <w:r>
+            <w:rPr/>
+            <w:t>1.1 BACKGROUND</w:t>
+            <w:tab/>
+            <w:t>1</w:t>
+          </w:r>
         </w:p>
         <w:p>
           <w:pPr>
@@ -566,16 +543,12 @@
             </w:tabs>
             <w:rPr/>
           </w:pPr>
-          <w:hyperlink w:anchor="__RefHeading___Toc2948_3810426074" w:tooltip="1.2 PROBLEM STATEMENT">
-            <w:r>
-              <w:rPr>
-                <w:rStyle w:val="IndexLink"/>
-              </w:rPr>
-              <w:t>1.2 PROBLEM STATEMENT</w:t>
-              <w:tab/>
-              <w:t>1</w:t>
-            </w:r>
-          </w:hyperlink>
+          <w:r>
+            <w:rPr/>
+            <w:t>1.2 PROBLEM STATEMENT</w:t>
+            <w:tab/>
+            <w:t>1</w:t>
+          </w:r>
         </w:p>
         <w:p>
           <w:pPr>
@@ -586,16 +559,12 @@
             </w:tabs>
             <w:rPr/>
           </w:pPr>
-          <w:hyperlink w:anchor="__RefHeading___Toc2946_3810426074" w:tooltip="1.3 MAIN OBJECTIVE">
-            <w:r>
-              <w:rPr>
-                <w:rStyle w:val="IndexLink"/>
-              </w:rPr>
-              <w:t>1.3 MAIN OBJECTIVE</w:t>
-              <w:tab/>
-              <w:t>1</w:t>
-            </w:r>
-          </w:hyperlink>
+          <w:r>
+            <w:rPr/>
+            <w:t>1.3 MAIN OBJECTIVE</w:t>
+            <w:tab/>
+            <w:t>1</w:t>
+          </w:r>
         </w:p>
         <w:p>
           <w:pPr>
@@ -606,16 +575,12 @@
             </w:tabs>
             <w:rPr/>
           </w:pPr>
-          <w:hyperlink w:anchor="__RefHeading___Toc2944_3810426074" w:tooltip="1.4 SPECIFIC OBJECTIVE">
-            <w:r>
-              <w:rPr>
-                <w:rStyle w:val="IndexLink"/>
-              </w:rPr>
-              <w:t>1.4 SPECIFIC OBJECTIVE</w:t>
-              <w:tab/>
-              <w:t>1</w:t>
-            </w:r>
-          </w:hyperlink>
+          <w:r>
+            <w:rPr/>
+            <w:t>1.4 SPECIFIC OBJECTIVE</w:t>
+            <w:tab/>
+            <w:t>1</w:t>
+          </w:r>
         </w:p>
         <w:p>
           <w:pPr>
@@ -626,16 +591,12 @@
             </w:tabs>
             <w:rPr/>
           </w:pPr>
-          <w:hyperlink w:anchor="__RefHeading___Toc381_3821115646" w:tooltip="1.5 SIGNIFICANCE OF STUDY">
-            <w:r>
-              <w:rPr>
-                <w:rStyle w:val="IndexLink"/>
-              </w:rPr>
-              <w:t>1.5 SIGNIFICANCE OF STUDY</w:t>
-              <w:tab/>
-              <w:t>2</w:t>
-            </w:r>
-          </w:hyperlink>
+          <w:r>
+            <w:rPr/>
+            <w:t>1.5 SIGNIFICANCE OF STUDY</w:t>
+            <w:tab/>
+            <w:t>2</w:t>
+          </w:r>
         </w:p>
         <w:p>
           <w:pPr>
@@ -646,16 +607,12 @@
             </w:tabs>
             <w:rPr/>
           </w:pPr>
-          <w:hyperlink w:anchor="__RefHeading___Toc2942_3810426074" w:tooltip="1.6 SCOPE AND LIMITATIONS">
-            <w:r>
-              <w:rPr>
-                <w:rStyle w:val="IndexLink"/>
-              </w:rPr>
-              <w:t>1.6 SCOPE AND LIMITATIONS</w:t>
-              <w:tab/>
-              <w:t>2</w:t>
-            </w:r>
-          </w:hyperlink>
+          <w:r>
+            <w:rPr/>
+            <w:t>1.6 SCOPE AND LIMITATIONS</w:t>
+            <w:tab/>
+            <w:t>2</w:t>
+          </w:r>
         </w:p>
         <w:p>
           <w:pPr>
@@ -666,16 +623,12 @@
             </w:tabs>
             <w:rPr/>
           </w:pPr>
-          <w:hyperlink w:anchor="__RefHeading___Toc2936_3810426074" w:tooltip="CHAPTER TWO: LITERATURE REVIEW">
-            <w:r>
-              <w:rPr>
-                <w:rStyle w:val="IndexLink"/>
-              </w:rPr>
-              <w:t>CHAPTER TWO: LITERATURE REVIEW</w:t>
-              <w:tab/>
-              <w:t>3</w:t>
-            </w:r>
-          </w:hyperlink>
+          <w:r>
+            <w:rPr/>
+            <w:t>CHAPTER TWO: LITERATURE REVIEW</w:t>
+            <w:tab/>
+            <w:t>3</w:t>
+          </w:r>
         </w:p>
         <w:p>
           <w:pPr>
@@ -686,16 +639,12 @@
             </w:tabs>
             <w:rPr/>
           </w:pPr>
-          <w:hyperlink w:anchor="__RefHeading___Toc2940_3810426074" w:tooltip="2.1 RELATED PROJECTS">
-            <w:r>
-              <w:rPr>
-                <w:rStyle w:val="IndexLink"/>
-              </w:rPr>
-              <w:t>2.1 RELATED PROJECTS</w:t>
-              <w:tab/>
-              <w:t>3</w:t>
-            </w:r>
-          </w:hyperlink>
+          <w:r>
+            <w:rPr/>
+            <w:t>2.1 RELATED PROJECTS</w:t>
+            <w:tab/>
+            <w:t>3</w:t>
+          </w:r>
         </w:p>
         <w:p>
           <w:pPr>
@@ -706,16 +655,12 @@
             </w:tabs>
             <w:rPr/>
           </w:pPr>
-          <w:hyperlink w:anchor="__RefHeading___Toc2938_3810426074" w:tooltip="2.2 RESEARCH GAP">
-            <w:r>
-              <w:rPr>
-                <w:rStyle w:val="IndexLink"/>
-              </w:rPr>
-              <w:t>2.2 RESEARCH GAP</w:t>
-              <w:tab/>
-              <w:t>3</w:t>
-            </w:r>
-          </w:hyperlink>
+          <w:r>
+            <w:rPr/>
+            <w:t>2.2 RESEARCH GAP</w:t>
+            <w:tab/>
+            <w:t>3</w:t>
+          </w:r>
         </w:p>
         <w:p>
           <w:pPr>
@@ -726,16 +671,12 @@
             </w:tabs>
             <w:rPr/>
           </w:pPr>
-          <w:hyperlink w:anchor="__RefHeading___Toc3054_3810426074" w:tooltip="CHAPTER THREE: SYSTEM DESIGN AND METHODOLOGY">
-            <w:r>
-              <w:rPr>
-                <w:rStyle w:val="IndexLink"/>
-              </w:rPr>
-              <w:t>CHAPTER THREE: SYSTEM DESIGN AND METHODOLOGY</w:t>
-              <w:tab/>
-              <w:t>4</w:t>
-            </w:r>
-          </w:hyperlink>
+          <w:r>
+            <w:rPr/>
+            <w:t>CHAPTER THREE: SYSTEM DESIGN AND METHODOLOGY</w:t>
+            <w:tab/>
+            <w:t>4</w:t>
+          </w:r>
         </w:p>
         <w:p>
           <w:pPr>
@@ -746,16 +687,12 @@
             </w:tabs>
             <w:rPr/>
           </w:pPr>
-          <w:hyperlink w:anchor="__RefHeading___Toc3062_3810426074" w:tooltip="3.1 SYSTEM ARCHITECTURE">
-            <w:r>
-              <w:rPr>
-                <w:rStyle w:val="IndexLink"/>
-              </w:rPr>
-              <w:t>3.1 SYSTEM ARCHITECTURE</w:t>
-              <w:tab/>
-              <w:t>4</w:t>
-            </w:r>
-          </w:hyperlink>
+          <w:r>
+            <w:rPr/>
+            <w:t>3.1 SYSTEM ARCHITECTURE</w:t>
+            <w:tab/>
+            <w:t>4</w:t>
+          </w:r>
         </w:p>
         <w:p>
           <w:pPr>
@@ -766,16 +703,12 @@
             </w:tabs>
             <w:rPr/>
           </w:pPr>
-          <w:hyperlink w:anchor="__RefHeading___Toc3060_3810426074" w:tooltip="3.2 FUNCTIONAL WORKFLOW">
-            <w:r>
-              <w:rPr>
-                <w:rStyle w:val="IndexLink"/>
-              </w:rPr>
-              <w:t>3.2 FUNCTIONAL WORKFLOW</w:t>
-              <w:tab/>
-              <w:t>5</w:t>
-            </w:r>
-          </w:hyperlink>
+          <w:r>
+            <w:rPr/>
+            <w:t>3.2 FUNCTIONAL WORKFLOW</w:t>
+            <w:tab/>
+            <w:t>5</w:t>
+          </w:r>
         </w:p>
         <w:p>
           <w:pPr>
@@ -786,16 +719,12 @@
             </w:tabs>
             <w:rPr/>
           </w:pPr>
-          <w:hyperlink w:anchor="__RefHeading___Toc3058_3810426074" w:tooltip="3.3 COMMUNICATION PROTOCOL">
-            <w:r>
-              <w:rPr>
-                <w:rStyle w:val="IndexLink"/>
-              </w:rPr>
-              <w:t>3.3 COMMUNICATION PROTOCOL</w:t>
-              <w:tab/>
-              <w:t>7</w:t>
-            </w:r>
-          </w:hyperlink>
+          <w:r>
+            <w:rPr/>
+            <w:t>3.3 COMMUNICATION PROTOCOL</w:t>
+            <w:tab/>
+            <w:t>7</w:t>
+          </w:r>
         </w:p>
         <w:p>
           <w:pPr>
@@ -806,16 +735,12 @@
             </w:tabs>
             <w:rPr/>
           </w:pPr>
-          <w:hyperlink w:anchor="__RefHeading___Toc3056_3810426074" w:tooltip="3.4 SYSTEM CIRCUIT DESIGN AND ITS ARCHITECTURE">
-            <w:r>
-              <w:rPr>
-                <w:rStyle w:val="IndexLink"/>
-              </w:rPr>
-              <w:t>3.4 SYSTEM CIRCUIT DESIGN AND ITS ARCHITECTURE</w:t>
-              <w:tab/>
-              <w:t>7</w:t>
-            </w:r>
-          </w:hyperlink>
+          <w:r>
+            <w:rPr/>
+            <w:t>3.4 SYSTEM CIRCUIT DESIGN AND ITS ARCHITECTURE</w:t>
+            <w:tab/>
+            <w:t>7</w:t>
+          </w:r>
         </w:p>
         <w:p>
           <w:pPr>
@@ -826,16 +751,12 @@
             </w:tabs>
             <w:rPr/>
           </w:pPr>
-          <w:hyperlink w:anchor="__RefHeading___Toc580_565102395" w:tooltip="3.4.1 COMPONENTS USED">
-            <w:r>
-              <w:rPr>
-                <w:rStyle w:val="IndexLink"/>
-              </w:rPr>
-              <w:t>3.4.1 COMPONENTS USED</w:t>
-              <w:tab/>
-              <w:t>7</w:t>
-            </w:r>
-          </w:hyperlink>
+          <w:r>
+            <w:rPr/>
+            <w:t>3.4.1 COMPONENTS USED</w:t>
+            <w:tab/>
+            <w:t>7</w:t>
+          </w:r>
         </w:p>
         <w:p>
           <w:pPr>
@@ -846,16 +767,12 @@
             </w:tabs>
             <w:rPr/>
           </w:pPr>
-          <w:hyperlink w:anchor="__RefHeading___Toc590_565102395" w:tooltip="3.4.2 HARDWARE CIRCUIT ARCHITECTURE">
-            <w:r>
-              <w:rPr>
-                <w:rStyle w:val="IndexLink"/>
-              </w:rPr>
-              <w:t>3.4.2 HARDWARE CIRCUIT ARCHITECTURE</w:t>
-              <w:tab/>
-              <w:t>8</w:t>
-            </w:r>
-          </w:hyperlink>
+          <w:r>
+            <w:rPr/>
+            <w:t>3.4.2 HARDWARE CIRCUIT ARCHITECTURE</w:t>
+            <w:tab/>
+            <w:t>8</w:t>
+          </w:r>
         </w:p>
         <w:p>
           <w:pPr>
@@ -866,16 +783,12 @@
             </w:tabs>
             <w:rPr/>
           </w:pPr>
-          <w:hyperlink w:anchor="__RefHeading___Toc588_565102395" w:tooltip="3.4.3 POWER REGULATION">
-            <w:r>
-              <w:rPr>
-                <w:rStyle w:val="IndexLink"/>
-              </w:rPr>
-              <w:t>3.4.3 POWER REGULATION</w:t>
-              <w:tab/>
-              <w:t>8</w:t>
-            </w:r>
-          </w:hyperlink>
+          <w:r>
+            <w:rPr/>
+            <w:t>3.4.3 POWER REGULATION</w:t>
+            <w:tab/>
+            <w:t>8</w:t>
+          </w:r>
         </w:p>
         <w:p>
           <w:pPr>
@@ -886,16 +799,12 @@
             </w:tabs>
             <w:rPr/>
           </w:pPr>
-          <w:hyperlink w:anchor="__RefHeading___Toc586_565102395" w:tooltip="3.4.4 STM32 CORE CIRCUIT DESIGN">
-            <w:r>
-              <w:rPr>
-                <w:rStyle w:val="IndexLink"/>
-              </w:rPr>
-              <w:t>3.4.4 STM32 CORE CIRCUIT DESIGN</w:t>
-              <w:tab/>
-              <w:t>9</w:t>
-            </w:r>
-          </w:hyperlink>
+          <w:r>
+            <w:rPr/>
+            <w:t>3.4.4 STM32 CORE CIRCUIT DESIGN</w:t>
+            <w:tab/>
+            <w:t>9</w:t>
+          </w:r>
         </w:p>
         <w:p>
           <w:pPr>
@@ -906,16 +815,12 @@
             </w:tabs>
             <w:rPr/>
           </w:pPr>
-          <w:hyperlink w:anchor="__RefHeading___Toc856_443172832" w:tooltip="3.4.5 MOTOR DRIVER AND ACTUATION CIRCUIT DESIGN">
-            <w:r>
-              <w:rPr>
-                <w:rStyle w:val="IndexLink"/>
-              </w:rPr>
-              <w:t>3.4.5 MOTOR DRIVER AND ACTUATION CIRCUIT DESIGN</w:t>
-              <w:tab/>
-              <w:t>10</w:t>
-            </w:r>
-          </w:hyperlink>
+          <w:r>
+            <w:rPr/>
+            <w:t>3.4.5 MOTOR DRIVER AND ACTUATION CIRCUIT DESIGN</w:t>
+            <w:tab/>
+            <w:t>10</w:t>
+          </w:r>
         </w:p>
         <w:p>
           <w:pPr>
@@ -926,16 +831,12 @@
             </w:tabs>
             <w:rPr/>
           </w:pPr>
-          <w:hyperlink w:anchor="__RefHeading___Toc482_3719139203" w:tooltip="3.5 COMPUTER VISION DESIGN INTEGRATION">
-            <w:r>
-              <w:rPr>
-                <w:rStyle w:val="IndexLink"/>
-              </w:rPr>
-              <w:t>3.5 COMPUTER VISION DESIGN INTEGRATION</w:t>
-              <w:tab/>
-              <w:t>10</w:t>
-            </w:r>
-          </w:hyperlink>
+          <w:r>
+            <w:rPr/>
+            <w:t>3.5 COMPUTER VISION DESIGN INTEGRATION</w:t>
+            <w:tab/>
+            <w:t>10</w:t>
+          </w:r>
         </w:p>
         <w:p>
           <w:pPr>
@@ -946,16 +847,12 @@
             </w:tabs>
             <w:rPr/>
           </w:pPr>
-          <w:hyperlink w:anchor="__RefHeading___Toc529_3719139203" w:tooltip="3.5.1 DESIGN DETAILS">
-            <w:r>
-              <w:rPr>
-                <w:rStyle w:val="IndexLink"/>
-              </w:rPr>
-              <w:t>3.5.1 DESIGN DETAILS</w:t>
-              <w:tab/>
-              <w:t>10</w:t>
-            </w:r>
-          </w:hyperlink>
+          <w:r>
+            <w:rPr/>
+            <w:t>3.5.1 DESIGN DETAILS</w:t>
+            <w:tab/>
+            <w:t>10</w:t>
+          </w:r>
         </w:p>
         <w:p>
           <w:pPr>
@@ -966,16 +863,12 @@
             </w:tabs>
             <w:rPr/>
           </w:pPr>
-          <w:hyperlink w:anchor="__RefHeading___Toc1478_3719139203" w:tooltip="3.5.2 PROCESSING PIPELINE">
-            <w:r>
-              <w:rPr>
-                <w:rStyle w:val="IndexLink"/>
-              </w:rPr>
-              <w:t>3.5.2 PROCESSING PIPELINE</w:t>
-              <w:tab/>
-              <w:t>11</w:t>
-            </w:r>
-          </w:hyperlink>
+          <w:r>
+            <w:rPr/>
+            <w:t>3.5.2 PROCESSING PIPELINE</w:t>
+            <w:tab/>
+            <w:t>11</w:t>
+          </w:r>
         </w:p>
         <w:p>
           <w:pPr>
@@ -986,16 +879,12 @@
             </w:tabs>
             <w:rPr/>
           </w:pPr>
-          <w:hyperlink w:anchor="__RefHeading___Toc1476_3719139203" w:tooltip="3.6 BACK-END AUTHENTICATION DESIGN">
-            <w:r>
-              <w:rPr>
-                <w:rStyle w:val="IndexLink"/>
-              </w:rPr>
-              <w:t>3.6 BACK-END AUTHENTICATION DESIGN</w:t>
-              <w:tab/>
-              <w:t>11</w:t>
-            </w:r>
-          </w:hyperlink>
+          <w:r>
+            <w:rPr/>
+            <w:t>3.6 BACK-END AUTHENTICATION DESIGN</w:t>
+            <w:tab/>
+            <w:t>11</w:t>
+          </w:r>
         </w:p>
         <w:p>
           <w:pPr>
@@ -1006,16 +895,12 @@
             </w:tabs>
             <w:rPr/>
           </w:pPr>
-          <w:hyperlink w:anchor="__RefHeading___Toc1187_2024957963" w:tooltip="3.6 MECHANICAL DESIGN">
-            <w:r>
-              <w:rPr>
-                <w:rStyle w:val="IndexLink"/>
-              </w:rPr>
-              <w:t>3.6 MECHANICAL DESIGN</w:t>
-              <w:tab/>
-              <w:t>12</w:t>
-            </w:r>
-          </w:hyperlink>
+          <w:r>
+            <w:rPr/>
+            <w:t>3.6 MECHANICAL DESIGN</w:t>
+            <w:tab/>
+            <w:t>12</w:t>
+          </w:r>
         </w:p>
         <w:p>
           <w:pPr>
@@ -1026,16 +911,12 @@
             </w:tabs>
             <w:rPr/>
           </w:pPr>
-          <w:hyperlink w:anchor="__RefHeading___Toc480_3719139203" w:tooltip="3.7 PROJECT SCHEDULE">
-            <w:r>
-              <w:rPr>
-                <w:rStyle w:val="IndexLink"/>
-              </w:rPr>
-              <w:t>3.7 PROJECT SCHEDULE</w:t>
-              <w:tab/>
-              <w:t>12</w:t>
-            </w:r>
-          </w:hyperlink>
+          <w:r>
+            <w:rPr/>
+            <w:t>3.7 PROJECT SCHEDULE</w:t>
+            <w:tab/>
+            <w:t>12</w:t>
+          </w:r>
         </w:p>
         <w:p>
           <w:pPr>
@@ -1046,16 +927,12 @@
             </w:tabs>
             <w:rPr/>
           </w:pPr>
-          <w:hyperlink w:anchor="__RefHeading___Toc386_1175120669" w:tooltip="3.8 PROJECT BUDGET">
-            <w:r>
-              <w:rPr>
-                <w:rStyle w:val="IndexLink"/>
-              </w:rPr>
-              <w:t>3.8 PROJECT BUDGET</w:t>
-              <w:tab/>
-              <w:t>13</w:t>
-            </w:r>
-          </w:hyperlink>
+          <w:r>
+            <w:rPr/>
+            <w:t>3.8 PROJECT BUDGET</w:t>
+            <w:tab/>
+            <w:t>13</w:t>
+          </w:r>
         </w:p>
         <w:p>
           <w:pPr>
@@ -1066,16 +943,12 @@
             </w:tabs>
             <w:rPr/>
           </w:pPr>
-          <w:hyperlink w:anchor="__RefHeading___Toc790_345661669" w:tooltip="CHAPTER FOUR: SOFTWARE IMPLEMENTATION AND CIRCUIT SIMULATION">
-            <w:r>
-              <w:rPr>
-                <w:rStyle w:val="IndexLink"/>
-              </w:rPr>
-              <w:t>CHAPTER FOUR: SOFTWARE IMPLEMENTATION AND CIRCUIT SIMULATION</w:t>
-              <w:tab/>
-              <w:t>15</w:t>
-            </w:r>
-          </w:hyperlink>
+          <w:r>
+            <w:rPr/>
+            <w:t>CHAPTER FOUR: SOFTWARE IMPLEMENTATION AND CIRCUIT SIMULATION</w:t>
+            <w:tab/>
+            <w:t>15</w:t>
+          </w:r>
         </w:p>
         <w:p>
           <w:pPr>
@@ -1086,16 +959,12 @@
             </w:tabs>
             <w:rPr/>
           </w:pPr>
-          <w:hyperlink w:anchor="__RefHeading___Toc794_345661669" w:tooltip="4.1 SOFTWARE IMPLEMENTATION">
-            <w:r>
-              <w:rPr>
-                <w:rStyle w:val="IndexLink"/>
-              </w:rPr>
-              <w:t>4.1 SOFTWARE IMPLEMENTATION</w:t>
-              <w:tab/>
-              <w:t>15</w:t>
-            </w:r>
-          </w:hyperlink>
+          <w:r>
+            <w:rPr/>
+            <w:t>4.1 SOFTWARE IMPLEMENTATION</w:t>
+            <w:tab/>
+            <w:t>15</w:t>
+          </w:r>
         </w:p>
         <w:p>
           <w:pPr>
@@ -1106,16 +975,12 @@
             </w:tabs>
             <w:rPr/>
           </w:pPr>
-          <w:hyperlink w:anchor="__RefHeading___Toc792_345661669" w:tooltip="4.2 CIRCUIT SIMULATION">
-            <w:r>
-              <w:rPr>
-                <w:rStyle w:val="IndexLink"/>
-              </w:rPr>
-              <w:t>4.2 CIRCUIT SIMULATION</w:t>
-              <w:tab/>
-              <w:t>16</w:t>
-            </w:r>
-          </w:hyperlink>
+          <w:r>
+            <w:rPr/>
+            <w:t>4.2 CIRCUIT SIMULATION</w:t>
+            <w:tab/>
+            <w:t>16</w:t>
+          </w:r>
         </w:p>
         <w:p>
           <w:pPr>
@@ -1126,16 +991,12 @@
             </w:tabs>
             <w:rPr/>
           </w:pPr>
-          <w:hyperlink w:anchor="__RefHeading___Toc854_443172832" w:tooltip="4.2.1 REVERSE POLARITY CIRCUIT">
-            <w:r>
-              <w:rPr>
-                <w:rStyle w:val="IndexLink"/>
-              </w:rPr>
-              <w:t>4.2.1 REVERSE POLARITY CIRCUIT</w:t>
-              <w:tab/>
-              <w:t>16</w:t>
-            </w:r>
-          </w:hyperlink>
+          <w:r>
+            <w:rPr/>
+            <w:t>4.2.1 REVERSE POLARITY CIRCUIT</w:t>
+            <w:tab/>
+            <w:t>16</w:t>
+          </w:r>
         </w:p>
         <w:p>
           <w:pPr>
@@ -1146,16 +1007,12 @@
             </w:tabs>
             <w:rPr/>
           </w:pPr>
-          <w:hyperlink w:anchor="__RefHeading___Toc852_443172832" w:tooltip="4.2.2 BUCK CONVERSION CIRCUITS">
-            <w:r>
-              <w:rPr>
-                <w:rStyle w:val="IndexLink"/>
-              </w:rPr>
-              <w:t>4.2.2 BUCK CONVERSION CIRCUITS</w:t>
-              <w:tab/>
-              <w:t>17</w:t>
-            </w:r>
-          </w:hyperlink>
+          <w:r>
+            <w:rPr/>
+            <w:t>4.2.2 BUCK CONVERSION CIRCUITS</w:t>
+            <w:tab/>
+            <w:t>17</w:t>
+          </w:r>
         </w:p>
         <w:p>
           <w:pPr>
@@ -1166,16 +1023,12 @@
             </w:tabs>
             <w:rPr/>
           </w:pPr>
-          <w:hyperlink w:anchor="__RefHeading___Toc1270_443172832" w:tooltip="4.2.3 MOTOR DRIVER CIRCUIT SIMULATION">
-            <w:r>
-              <w:rPr>
-                <w:rStyle w:val="IndexLink"/>
-              </w:rPr>
-              <w:t>4.2.3 MOTOR DRIVER CIRCUIT SIMULATION</w:t>
-              <w:tab/>
-              <w:t>20</w:t>
-            </w:r>
-          </w:hyperlink>
+          <w:r>
+            <w:rPr/>
+            <w:t>4.2.3 MOTOR DRIVER CIRCUIT SIMULATION</w:t>
+            <w:tab/>
+            <w:t>20</w:t>
+          </w:r>
         </w:p>
         <w:p>
           <w:pPr>
@@ -1186,16 +1039,12 @@
             </w:tabs>
             <w:rPr/>
           </w:pPr>
-          <w:hyperlink w:anchor="__RefHeading___Toc1185_2024957963" w:tooltip="CHAPTER FIVE: CONCLUSION">
-            <w:r>
-              <w:rPr>
-                <w:rStyle w:val="IndexLink"/>
-              </w:rPr>
-              <w:t>CHAPTER FIVE: CONCLUSION</w:t>
-              <w:tab/>
-              <w:t>21</w:t>
-            </w:r>
-          </w:hyperlink>
+          <w:r>
+            <w:rPr/>
+            <w:t>CHAPTER FIVE: CONCLUSION</w:t>
+            <w:tab/>
+            <w:t>21</w:t>
+          </w:r>
         </w:p>
         <w:p>
           <w:pPr>
@@ -1206,20 +1055,14 @@
             </w:tabs>
             <w:rPr/>
           </w:pPr>
-          <w:hyperlink w:anchor="__RefHeading___Toc2934_3810426074" w:tooltip="REFERENCES">
-            <w:r>
-              <w:rPr>
-                <w:rStyle w:val="IndexLink"/>
-              </w:rPr>
-              <w:t>REFERENCES</w:t>
-              <w:tab/>
-              <w:t>22</w:t>
-            </w:r>
-          </w:hyperlink>
           <w:r>
-            <w:rPr>
-              <w:rStyle w:val="IndexLink"/>
-            </w:rPr>
+            <w:rPr/>
+            <w:t>REFERENCES</w:t>
+            <w:tab/>
+            <w:t>22</w:t>
+          </w:r>
+          <w:r>
+            <w:rPr/>
             <w:fldChar w:fldCharType="end"/>
           </w:r>
         </w:p>
@@ -1368,16 +1211,17 @@
             </w:rPr>
             <w:fldChar w:fldCharType="separate"/>
           </w:r>
-          <w:hyperlink w:anchor="__RefHeading___Toc825_565102395" w:tooltip="Figure 1: System’s block diagram">
-            <w:r>
-              <w:rPr>
-                <w:rStyle w:val="IndexLink"/>
-              </w:rPr>
-              <w:t>Figure 1: System’s block diagram</w:t>
-              <w:tab/>
-              <w:t>4</w:t>
-            </w:r>
-          </w:hyperlink>
+          <w:r>
+            <w:rPr>
+              <w:rStyle w:val="IndexLink"/>
+            </w:rPr>
+            <w:t>Figure 1: System’s block diagram</w:t>
+          </w:r>
+          <w:r>
+            <w:rPr/>
+            <w:tab/>
+            <w:t>4</w:t>
+          </w:r>
         </w:p>
         <w:p>
           <w:pPr>
@@ -1388,16 +1232,12 @@
             </w:tabs>
             <w:rPr/>
           </w:pPr>
-          <w:hyperlink w:anchor="__RefHeading___Toc968_565102395" w:tooltip="Figure 2: Staff-side functional workflow">
-            <w:r>
-              <w:rPr>
-                <w:rStyle w:val="IndexLink"/>
-              </w:rPr>
-              <w:t>Figure 2: Staff-side functional workflow</w:t>
-              <w:tab/>
-              <w:t>6</w:t>
-            </w:r>
-          </w:hyperlink>
+          <w:r>
+            <w:rPr/>
+            <w:t>Figure 2: Staff-side functional workflow</w:t>
+            <w:tab/>
+            <w:t>6</w:t>
+          </w:r>
         </w:p>
         <w:p>
           <w:pPr>
@@ -1408,16 +1248,12 @@
             </w:tabs>
             <w:rPr/>
           </w:pPr>
-          <w:hyperlink w:anchor="__RefHeading___Toc970_565102395" w:tooltip="Figure 3: Student-side workflow">
-            <w:r>
-              <w:rPr>
-                <w:rStyle w:val="IndexLink"/>
-              </w:rPr>
-              <w:t>Figure 3: Student-side workflow</w:t>
-              <w:tab/>
-              <w:t>6</w:t>
-            </w:r>
-          </w:hyperlink>
+          <w:r>
+            <w:rPr/>
+            <w:t>Figure 3: Student-side workflow</w:t>
+            <w:tab/>
+            <w:t>6</w:t>
+          </w:r>
         </w:p>
         <w:p>
           <w:pPr>
@@ -1428,16 +1264,12 @@
             </w:tabs>
             <w:rPr/>
           </w:pPr>
-          <w:hyperlink w:anchor="__RefHeading___Toc878_443172832" w:tooltip="Figure 4: Reverse polarity circuit">
-            <w:r>
-              <w:rPr>
-                <w:rStyle w:val="IndexLink"/>
-              </w:rPr>
-              <w:t>Figure 4: Reverse polarity circuit</w:t>
-              <w:tab/>
-              <w:t>8</w:t>
-            </w:r>
-          </w:hyperlink>
+          <w:r>
+            <w:rPr/>
+            <w:t>Figure 4: Reverse polarity circuit</w:t>
+            <w:tab/>
+            <w:t>8</w:t>
+          </w:r>
         </w:p>
         <w:p>
           <w:pPr>
@@ -1448,16 +1280,12 @@
             </w:tabs>
             <w:rPr/>
           </w:pPr>
-          <w:hyperlink w:anchor="__RefHeading___Toc876_443172832" w:tooltip="Figure 5: LMZ23610 schematic design for 5V output.">
-            <w:r>
-              <w:rPr>
-                <w:rStyle w:val="IndexLink"/>
-              </w:rPr>
-              <w:t>Figure 5: LMZ23610 schematic design for 5V output.</w:t>
-              <w:tab/>
-              <w:t>9</w:t>
-            </w:r>
-          </w:hyperlink>
+          <w:r>
+            <w:rPr/>
+            <w:t>Figure 5: LMZ23610 schematic design for 5V output.</w:t>
+            <w:tab/>
+            <w:t>9</w:t>
+          </w:r>
         </w:p>
         <w:p>
           <w:pPr>
@@ -1468,16 +1296,12 @@
             </w:tabs>
             <w:rPr/>
           </w:pPr>
-          <w:hyperlink w:anchor="__RefHeading___Toc874_443172832" w:tooltip="Figure 6: PTSM82903 schematic design for 3.3V output.">
-            <w:r>
-              <w:rPr>
-                <w:rStyle w:val="IndexLink"/>
-              </w:rPr>
-              <w:t>Figure 6: PTSM82903 schematic design for 3.3V output.</w:t>
-              <w:tab/>
-              <w:t>9</w:t>
-            </w:r>
-          </w:hyperlink>
+          <w:r>
+            <w:rPr/>
+            <w:t>Figure 6: PTSM82903 schematic design for 3.3V output.</w:t>
+            <w:tab/>
+            <w:t>9</w:t>
+          </w:r>
         </w:p>
         <w:p>
           <w:pPr>
@@ -1488,16 +1312,12 @@
             </w:tabs>
             <w:rPr/>
           </w:pPr>
-          <w:hyperlink w:anchor="__RefHeading___Toc1325_565102395" w:tooltip="Figure 7: Motor driver connection schematic">
-            <w:r>
-              <w:rPr>
-                <w:rStyle w:val="IndexLink"/>
-              </w:rPr>
-              <w:t>Figure 7: Motor driver connection schematic</w:t>
-              <w:tab/>
-              <w:t>10</w:t>
-            </w:r>
-          </w:hyperlink>
+          <w:r>
+            <w:rPr/>
+            <w:t>Figure 7: Motor driver connection schematic</w:t>
+            <w:tab/>
+            <w:t>10</w:t>
+          </w:r>
         </w:p>
         <w:p>
           <w:pPr>
@@ -1508,16 +1328,12 @@
             </w:tabs>
             <w:rPr/>
           </w:pPr>
-          <w:hyperlink w:anchor="__RefHeading___Toc1323_565102395" w:tooltip="Figure 8: Processing pipeline workflow">
-            <w:r>
-              <w:rPr>
-                <w:rStyle w:val="IndexLink"/>
-              </w:rPr>
-              <w:t>Figure 8: Processing pipeline workflow</w:t>
-              <w:tab/>
-              <w:t>11</w:t>
-            </w:r>
-          </w:hyperlink>
+          <w:r>
+            <w:rPr/>
+            <w:t>Figure 8: Processing pipeline workflow</w:t>
+            <w:tab/>
+            <w:t>11</w:t>
+          </w:r>
         </w:p>
         <w:p>
           <w:pPr>
@@ -1528,16 +1344,12 @@
             </w:tabs>
             <w:rPr/>
           </w:pPr>
-          <w:hyperlink w:anchor="__RefHeading___Toc1264_2024957963" w:tooltip="Figure 9: Circular storage chamber">
-            <w:r>
-              <w:rPr>
-                <w:rStyle w:val="IndexLink"/>
-              </w:rPr>
-              <w:t>Figure 9: Circular storage chamber</w:t>
-              <w:tab/>
-              <w:t>12</w:t>
-            </w:r>
-          </w:hyperlink>
+          <w:r>
+            <w:rPr/>
+            <w:t>Figure 9: Circular storage chamber</w:t>
+            <w:tab/>
+            <w:t>12</w:t>
+          </w:r>
         </w:p>
         <w:p>
           <w:pPr>
@@ -1548,16 +1360,12 @@
             </w:tabs>
             <w:rPr/>
           </w:pPr>
-          <w:hyperlink w:anchor="__RefHeading___Toc966_565102395" w:tooltip="Figure 10: Semester 1 activity plan (Gantt Chart)">
-            <w:r>
-              <w:rPr>
-                <w:rStyle w:val="IndexLink"/>
-              </w:rPr>
-              <w:t>Figure 10: Semester 1 activity plan (Gantt Chart)</w:t>
-              <w:tab/>
-              <w:t>13</w:t>
-            </w:r>
-          </w:hyperlink>
+          <w:r>
+            <w:rPr/>
+            <w:t>Figure 10: Semester 1 activity plan (Gantt Chart)</w:t>
+            <w:tab/>
+            <w:t>13</w:t>
+          </w:r>
         </w:p>
         <w:p>
           <w:pPr>
@@ -1568,16 +1376,12 @@
             </w:tabs>
             <w:rPr/>
           </w:pPr>
-          <w:hyperlink w:anchor="__RefHeading___Toc964_565102395" w:tooltip="Figure 11: Semester 2 activity plan (Gantt Chart)">
-            <w:r>
-              <w:rPr>
-                <w:rStyle w:val="IndexLink"/>
-              </w:rPr>
-              <w:t>Figure 11: Semester 2 activity plan (Gantt Chart)</w:t>
-              <w:tab/>
-              <w:t>13</w:t>
-            </w:r>
-          </w:hyperlink>
+          <w:r>
+            <w:rPr/>
+            <w:t>Figure 11: Semester 2 activity plan (Gantt Chart)</w:t>
+            <w:tab/>
+            <w:t>13</w:t>
+          </w:r>
         </w:p>
         <w:p>
           <w:pPr>
@@ -1588,16 +1392,12 @@
             </w:tabs>
             <w:rPr/>
           </w:pPr>
-          <w:hyperlink w:anchor="__RefHeading___Toc754_345661669" w:tooltip="Figure 12: Sample card detected (green line shows detection)">
-            <w:r>
-              <w:rPr>
-                <w:rStyle w:val="IndexLink"/>
-              </w:rPr>
-              <w:t>Figure 12: Sample card detected (green line shows detection)</w:t>
-              <w:tab/>
-              <w:t>15</w:t>
-            </w:r>
-          </w:hyperlink>
+          <w:r>
+            <w:rPr/>
+            <w:t>Figure 12: Sample card detected (green line shows detection)</w:t>
+            <w:tab/>
+            <w:t>15</w:t>
+          </w:r>
         </w:p>
         <w:p>
           <w:pPr>
@@ -1608,16 +1408,12 @@
             </w:tabs>
             <w:rPr/>
           </w:pPr>
-          <w:hyperlink w:anchor="__RefHeading___Toc752_345661669" w:tooltip="Figure 13: Anchor-ROI localization of sample card">
-            <w:r>
-              <w:rPr>
-                <w:rStyle w:val="IndexLink"/>
-              </w:rPr>
-              <w:t>Figure 13: Anchor-ROI localization of sample card</w:t>
-              <w:tab/>
-              <w:t>16</w:t>
-            </w:r>
-          </w:hyperlink>
+          <w:r>
+            <w:rPr/>
+            <w:t>Figure 13: Anchor-ROI localization of sample card</w:t>
+            <w:tab/>
+            <w:t>16</w:t>
+          </w:r>
         </w:p>
         <w:p>
           <w:pPr>
@@ -1628,16 +1424,12 @@
             </w:tabs>
             <w:rPr/>
           </w:pPr>
-          <w:hyperlink w:anchor="__RefHeading___Toc750_345661669" w:tooltip="Figure 15: Text extraction and processing performances">
-            <w:r>
-              <w:rPr>
-                <w:rStyle w:val="IndexLink"/>
-              </w:rPr>
-              <w:t>Figure 15: Text extraction and processing performances</w:t>
-              <w:tab/>
-              <w:t>16</w:t>
-            </w:r>
-          </w:hyperlink>
+          <w:r>
+            <w:rPr/>
+            <w:t>Figure 15: Text extraction and processing performances</w:t>
+            <w:tab/>
+            <w:t>16</w:t>
+          </w:r>
         </w:p>
         <w:p>
           <w:pPr>
@@ -1648,16 +1440,12 @@
             </w:tabs>
             <w:rPr/>
           </w:pPr>
-          <w:hyperlink w:anchor="__RefHeading___Toc872_443172832" w:tooltip="Figure 15: Correct input polarity">
-            <w:r>
-              <w:rPr>
-                <w:rStyle w:val="IndexLink"/>
-              </w:rPr>
-              <w:t>Figure 15: Correct input polarity</w:t>
-              <w:tab/>
-              <w:t>17</w:t>
-            </w:r>
-          </w:hyperlink>
+          <w:r>
+            <w:rPr/>
+            <w:t>Figure 15: Correct input polarity</w:t>
+            <w:tab/>
+            <w:t>17</w:t>
+          </w:r>
         </w:p>
         <w:p>
           <w:pPr>
@@ -1668,16 +1456,12 @@
             </w:tabs>
             <w:rPr/>
           </w:pPr>
-          <w:hyperlink w:anchor="__RefHeading___Toc870_443172832" w:tooltip="Figure 16: Wrong input polarity">
-            <w:r>
-              <w:rPr>
-                <w:rStyle w:val="IndexLink"/>
-              </w:rPr>
-              <w:t>Figure 16: Wrong input polarity</w:t>
-              <w:tab/>
-              <w:t>17</w:t>
-            </w:r>
-          </w:hyperlink>
+          <w:r>
+            <w:rPr/>
+            <w:t>Figure 16: Wrong input polarity</w:t>
+            <w:tab/>
+            <w:t>17</w:t>
+          </w:r>
         </w:p>
         <w:p>
           <w:pPr>
@@ -1688,16 +1472,12 @@
             </w:tabs>
             <w:rPr/>
           </w:pPr>
-          <w:hyperlink w:anchor="__RefHeading___Toc868_443172832" w:tooltip="Figure 17: LMZ23610 simulation results at startup">
-            <w:r>
-              <w:rPr>
-                <w:rStyle w:val="IndexLink"/>
-              </w:rPr>
-              <w:t>Figure 17: LMZ23610 simulation results at startup</w:t>
-              <w:tab/>
-              <w:t>18</w:t>
-            </w:r>
-          </w:hyperlink>
+          <w:r>
+            <w:rPr/>
+            <w:t>Figure 17: LMZ23610 simulation results at startup</w:t>
+            <w:tab/>
+            <w:t>18</w:t>
+          </w:r>
         </w:p>
         <w:p>
           <w:pPr>
@@ -1708,16 +1488,12 @@
             </w:tabs>
             <w:rPr/>
           </w:pPr>
-          <w:hyperlink w:anchor="__RefHeading___Toc864_443172832" w:tooltip="Figure 18: LMZ23610 simulation results at steady state">
-            <w:r>
-              <w:rPr>
-                <w:rStyle w:val="IndexLink"/>
-              </w:rPr>
-              <w:t>Figure 18: LMZ23610 simulation results at steady state</w:t>
-              <w:tab/>
-              <w:t>18</w:t>
-            </w:r>
-          </w:hyperlink>
+          <w:r>
+            <w:rPr/>
+            <w:t>Figure 18: LMZ23610 simulation results at steady state</w:t>
+            <w:tab/>
+            <w:t>18</w:t>
+          </w:r>
         </w:p>
         <w:p>
           <w:pPr>
@@ -1728,16 +1504,12 @@
             </w:tabs>
             <w:rPr/>
           </w:pPr>
-          <w:hyperlink w:anchor="__RefHeading___Toc862_443172832" w:tooltip="Figure 19: PTSM82903 simulation results at start up">
-            <w:r>
-              <w:rPr>
-                <w:rStyle w:val="IndexLink"/>
-              </w:rPr>
-              <w:t>Figure 19: PTSM82903 simulation results at start up</w:t>
-              <w:tab/>
-              <w:t>19</w:t>
-            </w:r>
-          </w:hyperlink>
+          <w:r>
+            <w:rPr/>
+            <w:t>Figure 19: PTSM82903 simulation results at start up</w:t>
+            <w:tab/>
+            <w:t>19</w:t>
+          </w:r>
         </w:p>
         <w:p>
           <w:pPr>
@@ -1748,16 +1520,12 @@
             </w:tabs>
             <w:rPr/>
           </w:pPr>
-          <w:hyperlink w:anchor="__RefHeading___Toc860_443172832" w:tooltip="Figure 20: PTSM82903 simulation results at load transient">
-            <w:r>
-              <w:rPr>
-                <w:rStyle w:val="IndexLink"/>
-              </w:rPr>
-              <w:t>Figure 20: PTSM82903 simulation results at load transient</w:t>
-              <w:tab/>
-              <w:t>19</w:t>
-            </w:r>
-          </w:hyperlink>
+          <w:r>
+            <w:rPr/>
+            <w:t>Figure 20: PTSM82903 simulation results at load transient</w:t>
+            <w:tab/>
+            <w:t>19</w:t>
+          </w:r>
         </w:p>
         <w:p>
           <w:pPr>
@@ -1768,20 +1536,14 @@
             </w:tabs>
             <w:rPr/>
           </w:pPr>
-          <w:hyperlink w:anchor="__RefHeading___Toc1063_443172832" w:tooltip="Figure 21: 0011 and 1000 test signals (from MCU) to motor driver">
-            <w:r>
-              <w:rPr>
-                <w:rStyle w:val="IndexLink"/>
-              </w:rPr>
-              <w:t>Figure 21: 0011 and 1000 test signals (from MCU) to motor driver</w:t>
-              <w:tab/>
-              <w:t>20</w:t>
-            </w:r>
-          </w:hyperlink>
           <w:r>
-            <w:rPr>
-              <w:rStyle w:val="IndexLink"/>
-            </w:rPr>
+            <w:rPr/>
+            <w:t>Figure 21: 0011 and 1000 test signals (from MCU) to motor driver</w:t>
+            <w:tab/>
+            <w:t>20</w:t>
+          </w:r>
+          <w:r>
+            <w:rPr/>
             <w:fldChar w:fldCharType="end"/>
           </w:r>
         </w:p>
@@ -10001,15 +9763,15 @@
     <w:qFormat/>
     <w:rPr/>
   </w:style>
-  <w:style w:type="character" w:styleId="Bulletsuser">
-    <w:name w:val="Bullets (user)"/>
+  <w:style w:type="character" w:styleId="Bullets">
+    <w:name w:val="Bullets"/>
     <w:qFormat/>
     <w:rPr>
       <w:rFonts w:ascii="OpenSymbol" w:hAnsi="OpenSymbol" w:eastAsia="OpenSymbol" w:cs="OpenSymbol"/>
     </w:rPr>
   </w:style>
-  <w:style w:type="character" w:styleId="Bullets">
-    <w:name w:val="Bullets"/>
+  <w:style w:type="character" w:styleId="Bulletsuser">
+    <w:name w:val="Bullets (user)"/>
     <w:qFormat/>
     <w:rPr>
       <w:rFonts w:ascii="OpenSymbol" w:hAnsi="OpenSymbol" w:eastAsia="OpenSymbol" w:cs="OpenSymbol"/>

</xml_diff>